<commit_message>
Semester 1 Week 01: final README, answer-notebook explanations, small text fixes
- README: "Notes for staff" now describes the current files (review/PR history removed);
  step 1 refers to PDF pages; PDF-version line no longer dated.
- Answers notebook: results line in the opening cell, comments on imports, line formulas and
  feasible-region plot, a sentence for Exercise 2, and a "What do you notice?" cell after
  Exercise 7. Text and comments only; code and saved outputs unchanged.
- NumPy notebook: "a vector, which is really just a 1-column matrix"; np.array() is a function.
- Tutorial .docx (MATLAB): "column vector (right-hand side) b" (it said "solution"), three times.

[skip ci]

Co-Authored-By: Claude Opus 5.5 <noreply@anthropic.com>
Claude-Session: https://claude.ai/code/session_01XfPSt8Pj1dY9TCixZYSGbn
</commit_message>
<xml_diff>
--- a/content/Lectures/Semester 1/Week 01 - Introduction to Operational Research/5 Source Files/Week 1 - Tutorial.docx
+++ b/content/Lectures/Semester 1/Week 01 - Introduction to Operational Research/5 Source Files/Week 1 - Tutorial.docx
@@ -2254,7 +2254,7 @@
                 <w:sz w:val="18"/>
                 <w:szCs w:val="18"/>
               </w:rPr>
-              <w:t>% define the column vector (solution) b</w:t>
+              <w:t>% define the column vector (right-hand side) b</w:t>
             </w:r>
           </w:p>
           <w:p>
@@ -2541,7 +2541,7 @@
                 <w:sz w:val="18"/>
                 <w:szCs w:val="18"/>
               </w:rPr>
-              <w:t>% define the column vector (solution) b</w:t>
+              <w:t>% define the column vector (right-hand side) b</w:t>
             </w:r>
           </w:p>
           <w:p>
@@ -3839,7 +3839,7 @@
                 <w:sz w:val="18"/>
                 <w:szCs w:val="18"/>
               </w:rPr>
-              <w:t>% define the column vector (solution) b</w:t>
+              <w:t>% define the column vector (right-hand side) b</w:t>
             </w:r>
           </w:p>
           <w:p>

</xml_diff>